<commit_message>
Re-embed regenerated figures (Main Fig 2 now a 3-estimator forest)
Re-runs embed_figures.py against the refreshed output/figures/paper/ PNGs.
Main Fig 2 is now the comparison forest (sample mean / RDS-SS adjusted /
MA Bayesian) with the corresponding caption rewrite. The other 7 figures
re-embed unchanged from their current PNGs.

All output .docx files in paper/.../SIR/ at 2026-06-20 are now consistent
with the canonical R/analysis/07c-paper_figures.R pipeline.
</commit_message>
<xml_diff>
--- a/paper/OneDrive_1_22-05-2026/SIR/Figure 2 - 2026-06-20.docx
+++ b/paper/OneDrive_1_22-05-2026/SIR/Figure 2 - 2026-06-20.docx
@@ -9,7 +9,7 @@
       <w:r>
         <w:drawing>
           <wp:inline xmlns:a="http://schemas.openxmlformats.org/drawingml/2006/main" xmlns:pic="http://schemas.openxmlformats.org/drawingml/2006/picture">
-            <wp:extent cx="5486400" cy="2468880"/>
+            <wp:extent cx="5486400" cy="2438400"/>
             <wp:docPr id="1" name="Picture 1"/>
             <wp:cNvGraphicFramePr>
               <a:graphicFrameLocks noChangeAspect="1"/>
@@ -18,7 +18,7 @@
               <a:graphicData uri="http://schemas.openxmlformats.org/drawingml/2006/picture">
                 <pic:pic>
                   <pic:nvPicPr>
-                    <pic:cNvPr id="0" name="main_fig2_composite_risk_distribution.png"/>
+                    <pic:cNvPr id="0" name="main_fig2_composite_risk_comparison.png"/>
                     <pic:cNvPicPr/>
                   </pic:nvPicPr>
                   <pic:blipFill>
@@ -30,7 +30,7 @@
                   <pic:spPr>
                     <a:xfrm>
                       <a:off x="0" y="0"/>
-                      <a:ext cx="5486400" cy="2468880"/>
+                      <a:ext cx="5486400" cy="2438400"/>
                     </a:xfrm>
                     <a:prstGeom prst="rect"/>
                   </pic:spPr>
@@ -47,7 +47,7 @@
           <w:i/>
           <w:sz w:val="20"/>
         </w:rPr>
-        <w:t>Figure 2. Composite Risk Index: Sample vs. Population-Adjusted Estimates. Panel A shows the empirical distribution of the composite risk index in the observed RDS sample (n=85), with the sample mean marked. Panel B shows the Model-Assisted (MA) population estimate with its 95% credible interval, adjusted for RDS sampling bias. Source: Authors' own work.</w:t>
+        <w:t>Figure 2. Composite Risk Index: Comparison of Three Estimators. Mean composite risk index across the observed RDS sample (descriptive; n=85), the RDS-SS adjusted estimator (Gile's Successive Sampling with bootstrap 95% CI), and the Bayesian Model-Assisted (MA) estimator (with 95% credible interval). The wide MA credible interval reflects known limitations of model-assisted inference for continuous outcomes; the RDS-SS estimate is the more reliable population-adjusted figure. Source: Authors' own work.</w:t>
       </w:r>
     </w:p>
     <w:sectPr>

</xml_diff>